<commit_message>
Elevate source images to critical priority
</commit_message>
<xml_diff>
--- a/submission/Nhom25/Bao_cao_du_an_marketing_ai.docx
+++ b/submission/Nhom25/Bao_cao_du_an_marketing_ai.docx
@@ -503,7 +503,7 @@
                 <w:rFonts w:ascii="Times New Roman" w:hAnsi="Times New Roman"/>
                 <w:sz w:val="23"/>
               </w:rPr>
-              <w:t>P1 / HIGH — metadata quản lý hồ sơ</w:t>
+              <w:t>P0 / CRITICAL — hai ảnh nguồn authority cao nhất</w:t>
             </w:r>
           </w:p>
         </w:tc>
@@ -1084,6 +1084,108 @@
                 <w:rFonts w:ascii="Times New Roman" w:hAnsi="Times New Roman"/>
                 <w:sz w:val="19"/>
               </w:rPr>
+              <w:t>SRC-000</w:t>
+            </w:r>
+          </w:p>
+        </w:tc>
+        <w:tc>
+          <w:tcPr>
+            <w:tcW w:type="dxa" w:w="2494"/>
+            <w:tcMar>
+              <w:top w:w="100" w:type="dxa"/>
+              <w:start w:w="120" w:type="dxa"/>
+              <w:bottom w:w="100" w:type="dxa"/>
+              <w:end w:w="120" w:type="dxa"/>
+            </w:tcMar>
+            <w:vAlign w:val="center"/>
+          </w:tcPr>
+          <w:p>
+            <w:pPr>
+              <w:spacing w:after="0" w:line="276" w:lineRule="auto"/>
+            </w:pPr>
+            <w:r/>
+            <w:r>
+              <w:rPr>
+                <w:rFonts w:ascii="Consolas" w:hAnsi="Consolas"/>
+                <w:sz w:val="19"/>
+              </w:rPr>
+              <w:t>source-materials/BÀI KIỂM TRA.png</w:t>
+            </w:r>
+          </w:p>
+        </w:tc>
+        <w:tc>
+          <w:tcPr>
+            <w:tcW w:type="dxa" w:w="2721"/>
+            <w:tcMar>
+              <w:top w:w="100" w:type="dxa"/>
+              <w:start w:w="120" w:type="dxa"/>
+              <w:bottom w:w="100" w:type="dxa"/>
+              <w:end w:w="120" w:type="dxa"/>
+            </w:tcMar>
+            <w:vAlign w:val="center"/>
+          </w:tcPr>
+          <w:p>
+            <w:pPr>
+              <w:spacing w:after="0" w:line="276" w:lineRule="auto"/>
+            </w:pPr>
+            <w:r/>
+            <w:r>
+              <w:rPr>
+                <w:rFonts w:ascii="Times New Roman" w:hAnsi="Times New Roman"/>
+                <w:sz w:val="19"/>
+              </w:rPr>
+              <w:t>CANONICAL</w:t>
+            </w:r>
+          </w:p>
+        </w:tc>
+        <w:tc>
+          <w:tcPr>
+            <w:tcW w:type="dxa" w:w="2211"/>
+            <w:tcMar>
+              <w:top w:w="100" w:type="dxa"/>
+              <w:start w:w="120" w:type="dxa"/>
+              <w:bottom w:w="100" w:type="dxa"/>
+              <w:end w:w="120" w:type="dxa"/>
+            </w:tcMar>
+            <w:vAlign w:val="center"/>
+          </w:tcPr>
+          <w:p>
+            <w:pPr>
+              <w:spacing w:after="0" w:line="276" w:lineRule="auto"/>
+            </w:pPr>
+            <w:r/>
+            <w:r>
+              <w:rPr>
+                <w:rFonts w:ascii="Times New Roman" w:hAnsi="Times New Roman"/>
+                <w:sz w:val="19"/>
+              </w:rPr>
+              <w:t>P0 / CRITICAL — 10 tiêu chí đánh giá</w:t>
+            </w:r>
+          </w:p>
+        </w:tc>
+      </w:tr>
+      <w:tr>
+        <w:tc>
+          <w:tcPr>
+            <w:tcW w:type="dxa" w:w="1361"/>
+            <w:tcMar>
+              <w:top w:w="100" w:type="dxa"/>
+              <w:start w:w="120" w:type="dxa"/>
+              <w:bottom w:w="100" w:type="dxa"/>
+              <w:end w:w="120" w:type="dxa"/>
+            </w:tcMar>
+            <w:vAlign w:val="center"/>
+          </w:tcPr>
+          <w:p>
+            <w:pPr>
+              <w:spacing w:after="0" w:line="276" w:lineRule="auto"/>
+            </w:pPr>
+            <w:r/>
+            <w:r>
+              <w:rPr>
+                <w:rFonts w:ascii="Times New Roman" w:hAnsi="Times New Roman"/>
+                <w:sz w:val="19"/>
+              </w:rPr>
               <w:t>SRC-001</w:t>
             </w:r>
           </w:p>
@@ -1159,7 +1261,7 @@
                 <w:rFonts w:ascii="Times New Roman" w:hAnsi="Times New Roman"/>
                 <w:sz w:val="19"/>
               </w:rPr>
-              <w:t>Đề tài, học phần, mã và yêu cầu</w:t>
+              <w:t>P0 / CRITICAL — đề tài, học phần, mã và yêu cầu</w:t>
             </w:r>
           </w:p>
         </w:tc>

</xml_diff>